<commit_message>
Update resume (PDF and DOCX)
Co-Authored-By: Claude Opus 5.5 <noreply@anthropic.com>
</commit_message>
<xml_diff>
--- a/src/assets/Samil_Abud_FullStack_Engineer_Resume.docx
+++ b/src/assets/Samil_Abud_FullStack_Engineer_Resume.docx
@@ -20,7 +20,7 @@
           <w:b/>
           <w:sz w:val="23"/>
         </w:rPr>
-        <w:t>Senior Full-Stack &amp; AI Engineer</w:t>
+        <w:t xml:space="preserve">Senior Full-Stack Engineer | Next.js, TypeScript, PostgreSQL, AI Integration</w:t>
       </w:r>
     </w:p>
     <w:p>
@@ -131,16 +131,16 @@
     </w:p>
     <w:p>
       <w:r>
-        <w:t xml:space="preserve">Results-driven Full-Stack Web Developer with 10+ years of experience building, optimizing, and scaling robust web applications for high-profile clients. Skilled in JavaScript/TypeScript, React, Next.js, and NodeJS, with production depth in </w:t>
+        <w:t xml:space="preserve">Full-stack engineer with 10+ years of experience building and shipping web products with </w:t>
       </w:r>
       <w:r>
         <w:rPr>
           <w:b/>
         </w:rPr>
-        <w:t>AI/LLM-powered products</w:t>
+        <w:t xml:space="preserve">Next.js, React, TypeScript, Node.js and PostgreSQL</w:t>
       </w:r>
       <w:r>
-        <w:t>, integrating the Anthropic Claude API into vision-based document-processing pipelines — and independently architecting full-stack platforms from database to deployment, including authentication, real-time messaging, and payments. Adept at leading cross-functional teams, mentoring junior developers, and collaborating with stakeholders to exceed project goals.</w:t>
+        <w:t xml:space="preserve">, from the interface to the API, payments and deployment. Experience with Stripe subscriptions and signed webhooks, third-party API integration, background jobs, Tailwind CSS and Material UI, and automated testing with Jest. Production AI work with the Anthropic Claude API, including a vision-based document-extraction pipeline. Built a live rental marketplace (frontend and backend) and a multi-tenant booking platform for a real client. Top Rated on Upwork with a 100% Job Success score.</w:t>
       </w:r>
     </w:p>
     <w:p>
@@ -170,7 +170,7 @@
         <w:rPr>
           <w:sz w:val="21"/>
         </w:rPr>
-        <w:t>HTML5, CSS3, JavaScript, TypeScript, React, Next.js (App Router, Server Actions), Vue, React Native, Redux, Tailwind, Radix UI, Material-UI</w:t>
+        <w:t xml:space="preserve">TypeScript, React, Next.js (App Router, Server Actions), Tailwind CSS, Material-UI, Redux Toolkit, HTML5, CSS3, JavaScript, React Native, Radix UI</w:t>
       </w:r>
     </w:p>
     <w:p>
@@ -188,7 +188,7 @@
         <w:rPr>
           <w:sz w:val="21"/>
         </w:rPr>
-        <w:t>NodeJS, NestJS, Express.js, RESTful APIs, GraphQL, Python, Django, Zod, event-driven jobs (Inngest), NextAuth</w:t>
+        <w:t xml:space="preserve">Node.js, Next.js route handlers, Express.js, NestJS, RESTful APIs and third-party API integration, Stripe (subscriptions, signed webhooks), event-driven jobs (Inngest), NextAuth, Zod, GraphQL, Python, Django</w:t>
       </w:r>
     </w:p>
     <w:p>
@@ -206,7 +206,7 @@
         <w:rPr>
           <w:sz w:val="21"/>
         </w:rPr>
-        <w:t>Anthropic Claude API, LLM integration, vision-based document data extraction, prompt engineering, AI-assisted / agent-driven development</w:t>
+        <w:t xml:space="preserve">Anthropic Claude API, LLM integration, vision-based document data extraction, prompt engineering, AI-assisted / agent-driven development</w:t>
       </w:r>
     </w:p>
     <w:p>
@@ -224,7 +224,7 @@
         <w:rPr>
           <w:sz w:val="21"/>
         </w:rPr>
-        <w:t>PostgreSQL (multi-schema), MySQL, MongoDB, SQL Server, Oracle, Prisma, Mongoose, TypeORM</w:t>
+        <w:t xml:space="preserve">PostgreSQL (multi-schema), Prisma, MongoDB, Mongoose, MySQL, TypeORM</w:t>
       </w:r>
     </w:p>
     <w:p>
@@ -260,7 +260,7 @@
         <w:rPr>
           <w:sz w:val="21"/>
         </w:rPr>
-        <w:t>Git/GitHub, Figma, Postman, Jest, React Testing Library, Playwright, Cypress, Jira</w:t>
+        <w:t xml:space="preserve">Jest, React Testing Library, Playwright, Cypress, Git/GitHub, Postman, Figma, Jira</w:t>
       </w:r>
     </w:p>
     <w:p>
@@ -272,13 +272,100 @@
           <w:b/>
           <w:sz w:val="21"/>
         </w:rPr>
-        <w:t xml:space="preserve">Project Management: </w:t>
+        <w:t xml:space="preserve">Ways of Working: </w:t>
       </w:r>
       <w:r>
         <w:rPr>
           <w:sz w:val="21"/>
         </w:rPr>
-        <w:t>Agile/Scrum, Leadership, Cross-functional Collaboration</w:t>
+        <w:t xml:space="preserve">Agile/Scrum, cross-functional collaboration, clear written communication</w:t>
+      </w:r>
+    </w:p>
+    <w:p>
+      <w:pPr>
+        <w:pBdr>
+          <w:bottom w:val="single" w:sz="6" w:space="2" w:color="999999"/>
+        </w:pBdr>
+        <w:spacing w:before="200"/>
+      </w:pPr>
+      <w:r>
+        <w:rPr>
+          <w:b/>
+          <w:sz w:val="26"/>
+        </w:rPr>
+        <w:t xml:space="preserve">SELECTED PROJECTS</w:t>
+      </w:r>
+    </w:p>
+    <w:p>
+      <w:pPr>
+        <w:pStyle w:val="ListBullet"/>
+      </w:pPr>
+      <w:r>
+        <w:rPr>
+          <w:b/>
+          <w:sz w:val="21"/>
+        </w:rPr>
+        <w:t xml:space="preserve">CityRoomFinder</w:t>
+      </w:r>
+      <w:r>
+        <w:rPr>
+          <w:sz w:val="21"/>
+        </w:rPr>
+        <w:t xml:space="preserve"> (live rental and roommate marketplace with real users): built the frontend and the backend, including role-based dashboards and messaging. Performance pass: mobile Lighthouse 64 to 85, LCP 9.5s to 3.7s, desktop 83 to 100.</w:t>
+      </w:r>
+    </w:p>
+    <w:p>
+      <w:pPr>
+        <w:pStyle w:val="ListBullet"/>
+      </w:pPr>
+      <w:r>
+        <w:rPr>
+          <w:b/>
+          <w:sz w:val="21"/>
+        </w:rPr>
+        <w:t xml:space="preserve">Discount Club</w:t>
+      </w:r>
+      <w:r>
+        <w:rPr>
+          <w:sz w:val="21"/>
+        </w:rPr>
+        <w:t xml:space="preserve"> (multi-tenant booking platform for a real client): Next.js, TypeScript, Tailwind CSS and MongoDB. Owned the schema, passwordless login, admin tooling and email, from a single codebase on Vercel.</w:t>
+      </w:r>
+    </w:p>
+    <w:p>
+      <w:pPr>
+        <w:pStyle w:val="ListBullet"/>
+      </w:pPr>
+      <w:r>
+        <w:rPr>
+          <w:b/>
+          <w:sz w:val="21"/>
+        </w:rPr>
+        <w:t xml:space="preserve">PlantPal</w:t>
+      </w:r>
+      <w:r>
+        <w:rPr>
+          <w:sz w:val="21"/>
+        </w:rPr>
+        <w:t xml:space="preserve"> (React Native app, live on Google Play): Expo app with a Next.js API and PostgreSQL. Offline-first sync, push notifications, RevenueCat subscriptions with a signed, idempotent webhook, and 185 automated tests. Built with AI assistance (Claude Code).</w:t>
+      </w:r>
+    </w:p>
+    <w:p>
+      <w:pPr>
+        <w:pStyle w:val="ListBullet"/>
+      </w:pPr>
+      <w:r>
+        <w:rPr>
+          <w:b/>
+          <w:sz w:val="21"/>
+        </w:rPr>
+        <w:t xml:space="preserve">MyMedDiary</w:t>
+      </w:r>
+      <w:r>
+        <w:rPr>
+          <w:sz w:val="21"/>
+        </w:rPr>
+        <w:t xml:space="preserve"> (health research dashboard): React, TypeScript, Material-UI, charts and tests.</w:t>
       </w:r>
     </w:p>
     <w:p>

</xml_diff>

<commit_message>
Refocus portfolio and resume as Senior Full-Stack & AI Engineer
- New title across page title, meta/OG/Twitter tags, JSON-LD and hero
- Hero and About copy lead with production AI work (Claude API,
  document extraction, background LLM jobs) on a Next.js/TypeScript stack
- Skills regrouped: AI & LLM, Full-Stack Core, APIs & Integrations first
- StoryKeep moved up to the third project card, title mentions Claude
- Resume: new headline and summary, AI/LLM skills first, StoryKeep added
  to Selected Projects; PDF re-exported from the DOCX

Co-Authored-By: Claude Opus 5.5 <noreply@anthropic.com>
</commit_message>
<xml_diff>
--- a/src/assets/Samil_Abud_FullStack_Engineer_Resume.docx
+++ b/src/assets/Samil_Abud_FullStack_Engineer_Resume.docx
@@ -20,7 +20,7 @@
           <w:b/>
           <w:sz w:val="23"/>
         </w:rPr>
-        <w:t xml:space="preserve">Senior Full-Stack Engineer | Next.js, TypeScript, PostgreSQL, AI Integration</w:t>
+        <w:t xml:space="preserve">Senior Full-Stack &amp; AI Engineer | Next.js, TypeScript, LLM Integration, PostgreSQL</w:t>
       </w:r>
     </w:p>
     <w:p>
@@ -131,16 +131,25 @@
     </w:p>
     <w:p>
       <w:r>
-        <w:t xml:space="preserve">Full-stack engineer with 10+ years of experience building and shipping web products with </w:t>
+        <w:t xml:space="preserve">Full-stack and AI engineer with 10+ years of experience building and shipping web products with </w:t>
       </w:r>
       <w:r>
         <w:rPr>
           <w:b/>
         </w:rPr>
-        <w:t xml:space="preserve">Next.js, React, TypeScript, Node.js and PostgreSQL</w:t>
+        <w:t xml:space="preserve">Next.js, TypeScript, React, Node.js and PostgreSQL</w:t>
       </w:r>
       <w:r>
-        <w:t xml:space="preserve">, from the interface to the API, payments and deployment. Experience with Stripe subscriptions and signed webhooks, third-party API integration, background jobs, Tailwind CSS and Material UI, and automated testing with Jest. Production AI work with the Anthropic Claude API, including a vision-based document-extraction pipeline. Built a live rental marketplace (frontend and backend) and a multi-tenant booking platform for a real client. Top Rated on Upwork with a 100% Job Success score.</w:t>
+        <w:t xml:space="preserve">, with AI built into the product: </w:t>
+      </w:r>
+      <w:r>
+        <w:rPr>
+          <w:b/>
+        </w:rPr>
+        <w:t xml:space="preserve">Anthropic Claude API</w:t>
+      </w:r>
+      <w:r>
+        <w:t xml:space="preserve"> integration, a production vision-based document-extraction pipeline (accuracy on affected credential types raised from ~70% to ~100%), and LLM generation in idempotent background jobs with retries, output validation and per-user cost caps. Owns the rest of the stack too: Stripe subscriptions and signed webhooks, third-party API integration, auth, Tailwind CSS, automated testing (Jest, Playwright) and deployment on AWS and Vercel. Built a live rental marketplace (frontend and backend) and a multi-tenant booking platform for a real client. Top Rated on Upwork with a 100% Job Success score.</w:t>
       </w:r>
     </w:p>
     <w:p>
@@ -164,6 +173,24 @@
           <w:b/>
           <w:sz w:val="21"/>
         </w:rPr>
+        <w:t xml:space="preserve">AI / LLM: </w:t>
+      </w:r>
+      <w:r>
+        <w:rPr>
+          <w:sz w:val="21"/>
+        </w:rPr>
+        <w:t xml:space="preserve">Anthropic Claude API, LLM integration, vision-based document data extraction, prompt engineering, output validation and fallbacks, background AI jobs (Inngest) with retries and cost caps, AI-assisted / agent-driven development (Claude Code)</w:t>
+      </w:r>
+    </w:p>
+    <w:p>
+      <w:pPr>
+        <w:pStyle w:val="ListBullet"/>
+      </w:pPr>
+      <w:r>
+        <w:rPr>
+          <w:b/>
+          <w:sz w:val="21"/>
+        </w:rPr>
         <w:t xml:space="preserve">Front-End: </w:t>
       </w:r>
       <w:r>
@@ -200,24 +227,6 @@
           <w:b/>
           <w:sz w:val="21"/>
         </w:rPr>
-        <w:t xml:space="preserve">AI / LLM: </w:t>
-      </w:r>
-      <w:r>
-        <w:rPr>
-          <w:sz w:val="21"/>
-        </w:rPr>
-        <w:t xml:space="preserve">Anthropic Claude API, LLM integration, vision-based document data extraction, prompt engineering, AI-assisted / agent-driven development</w:t>
-      </w:r>
-    </w:p>
-    <w:p>
-      <w:pPr>
-        <w:pStyle w:val="ListBullet"/>
-      </w:pPr>
-      <w:r>
-        <w:rPr>
-          <w:b/>
-          <w:sz w:val="21"/>
-        </w:rPr>
         <w:t xml:space="preserve">Database: </w:t>
       </w:r>
       <w:r>
@@ -294,6 +303,24 @@
           <w:sz w:val="26"/>
         </w:rPr>
         <w:t xml:space="preserve">SELECTED PROJECTS</w:t>
+      </w:r>
+    </w:p>
+    <w:p>
+      <w:pPr>
+        <w:pStyle w:val="ListBullet"/>
+      </w:pPr>
+      <w:r>
+        <w:rPr>
+          <w:b/>
+          <w:sz w:val="21"/>
+        </w:rPr>
+        <w:t xml:space="preserve">StoryKeep</w:t>
+      </w:r>
+      <w:r>
+        <w:rPr>
+          <w:sz w:val="21"/>
+        </w:rPr>
+        <w:t xml:space="preserve"> (AI life-story writer, Stripe test mode): Next.js, TypeScript, PostgreSQL and the Anthropic Claude API. Claude generation runs in idempotent background jobs with retries and a per-user cost cap; Stripe subscriptions with dunning and signature-verified, replay-safe webhooks; PDF/DOCX export; 191 automated tests and CI. Built with AI assistance (Claude Code).</w:t>
       </w:r>
     </w:p>
     <w:p>

</xml_diff>